<commit_message>
-se agregaron documentacion de metricas para soa
</commit_message>
<xml_diff>
--- a/vibecoding/PC/TP1/Case Test Python.docx
+++ b/vibecoding/PC/TP1/Case Test Python.docx
@@ -1,6 +1,6 @@
 
 <file path=word/document.xml><?xml version="1.0" encoding="utf-8"?>
-<w:document xmlns:wpc="http://schemas.microsoft.com/office/word/2010/wordprocessingCanvas" xmlns:cx="http://schemas.microsoft.com/office/drawing/2014/chartex" xmlns:cx1="http://schemas.microsoft.com/office/drawing/2015/9/8/chartex" xmlns:cx2="http://schemas.microsoft.com/office/drawing/2015/10/21/chartex" xmlns:cx3="http://schemas.microsoft.com/office/drawing/2016/5/9/chartex" xmlns:cx4="http://schemas.microsoft.com/office/drawing/2016/5/10/chartex" xmlns:cx5="http://schemas.microsoft.com/office/drawing/2016/5/11/chartex" xmlns:cx6="http://schemas.microsoft.com/office/drawing/2016/5/12/chartex" xmlns:cx7="http://schemas.microsoft.com/office/drawing/2016/5/13/chartex" xmlns:cx8="http://schemas.microsoft.com/office/drawing/2016/5/14/chartex" xmlns:mc="http://schemas.openxmlformats.org/markup-compatibility/2006" xmlns:aink="http://schemas.microsoft.com/office/drawing/2016/ink" xmlns:am3d="http://schemas.microsoft.com/office/drawing/2017/model3d" xmlns:o="urn:schemas-microsoft-com:office:office" xmlns:oel="http://schemas.microsoft.com/office/2019/extlst" xmlns:r="http://schemas.openxmlformats.org/officeDocument/2006/relationships" xmlns:m="http://schemas.openxmlformats.org/officeDocument/2006/math" xmlns:v="urn:schemas-microsoft-com:vml" xmlns:wp14="http://schemas.microsoft.com/office/word/2010/wordprocessingDrawing" xmlns:wp="http://schemas.openxmlformats.org/drawingml/2006/wordprocessingDrawing" xmlns:w10="urn:schemas-microsoft-com:office:word" xmlns:w="http://schemas.openxmlformats.org/wordprocessingml/2006/main" xmlns:w14="http://schemas.microsoft.com/office/word/2010/wordml" xmlns:w15="http://schemas.microsoft.com/office/word/2012/wordml" xmlns:w16cex="http://schemas.microsoft.com/office/word/2018/wordml/cex" xmlns:w16cid="http://schemas.microsoft.com/office/word/2016/wordml/cid" xmlns:w16="http://schemas.microsoft.com/office/word/2018/wordml" xmlns:w16du="http://schemas.microsoft.com/office/word/2023/wordml/word16du" xmlns:w16sdtdh="http://schemas.microsoft.com/office/word/2020/wordml/sdtdatahash" xmlns:w16sdtfl="http://schemas.microsoft.com/office/word/2024/wordml/sdtformatlock" xmlns:w16se="http://schemas.microsoft.com/office/word/2015/wordml/symex" xmlns:wpg="http://schemas.microsoft.com/office/word/2010/wordprocessingGroup" xmlns:wpi="http://schemas.microsoft.com/office/word/2010/wordprocessingInk" xmlns:wne="http://schemas.microsoft.com/office/word/2006/wordml" xmlns:wps="http://schemas.microsoft.com/office/word/2010/wordprocessingShape" mc:Ignorable="w14 w15 w16se w16cid w16 w16cex w16sdtdh w16sdtfl w16du wp14">
+<w:document xmlns:wpc="http://schemas.microsoft.com/office/word/2010/wordprocessingCanvas" xmlns:cx="http://schemas.microsoft.com/office/drawing/2014/chartex" xmlns:cx1="http://schemas.microsoft.com/office/drawing/2015/9/8/chartex" xmlns:cx2="http://schemas.microsoft.com/office/drawing/2015/10/21/chartex" xmlns:cx3="http://schemas.microsoft.com/office/drawing/2016/5/9/chartex" xmlns:cx4="http://schemas.microsoft.com/office/drawing/2016/5/10/chartex" xmlns:cx5="http://schemas.microsoft.com/office/drawing/2016/5/11/chartex" xmlns:cx6="http://schemas.microsoft.com/office/drawing/2016/5/12/chartex" xmlns:cx7="http://schemas.microsoft.com/office/drawing/2016/5/13/chartex" xmlns:cx8="http://schemas.microsoft.com/office/drawing/2016/5/14/chartex" xmlns:mc="http://schemas.openxmlformats.org/markup-compatibility/2006" xmlns:aink="http://schemas.microsoft.com/office/drawing/2016/ink" xmlns:am3d="http://schemas.microsoft.com/office/drawing/2017/model3d" xmlns:o="urn:schemas-microsoft-com:office:office" xmlns:r="http://schemas.openxmlformats.org/officeDocument/2006/relationships" xmlns:m="http://schemas.openxmlformats.org/officeDocument/2006/math" xmlns:v="urn:schemas-microsoft-com:vml" xmlns:wp14="http://schemas.microsoft.com/office/word/2010/wordprocessingDrawing" xmlns:wp="http://schemas.openxmlformats.org/drawingml/2006/wordprocessingDrawing" xmlns:w10="urn:schemas-microsoft-com:office:word" xmlns:w="http://schemas.openxmlformats.org/wordprocessingml/2006/main" xmlns:w14="http://schemas.microsoft.com/office/word/2010/wordml" xmlns:w15="http://schemas.microsoft.com/office/word/2012/wordml" xmlns:w16cex="http://schemas.microsoft.com/office/word/2018/wordml/cex" xmlns:w16cid="http://schemas.microsoft.com/office/word/2016/wordml/cid" xmlns:w16="http://schemas.microsoft.com/office/word/2018/wordml" xmlns:w16sdtdh="http://schemas.microsoft.com/office/word/2020/wordml/sdtdatahash" xmlns:w16se="http://schemas.microsoft.com/office/word/2015/wordml/symex" xmlns:wpg="http://schemas.microsoft.com/office/word/2010/wordprocessingGroup" xmlns:wpi="http://schemas.microsoft.com/office/word/2010/wordprocessingInk" xmlns:wne="http://schemas.microsoft.com/office/word/2006/wordml" xmlns:wps="http://schemas.microsoft.com/office/word/2010/wordprocessingShape" mc:Ignorable="w14 w15 w16se w16cid w16 w16cex w16sdtdh wp14">
   <w:body>
     <w:p>
       <w:pPr>
@@ -136,7 +136,7 @@
                     <pic:cNvPicPr/>
                   </pic:nvPicPr>
                   <pic:blipFill>
-                    <a:blip r:embed="rId6"/>
+                    <a:blip r:embed="rId8"/>
                     <a:stretch>
                       <a:fillRect/>
                     </a:stretch>
@@ -614,7 +614,7 @@
                     <pic:cNvPicPr/>
                   </pic:nvPicPr>
                   <pic:blipFill>
-                    <a:blip r:embed="rId7"/>
+                    <a:blip r:embed="rId9"/>
                     <a:stretch>
                       <a:fillRect/>
                     </a:stretch>
@@ -695,7 +695,7 @@
                     <pic:cNvPicPr/>
                   </pic:nvPicPr>
                   <pic:blipFill>
-                    <a:blip r:embed="rId8"/>
+                    <a:blip r:embed="rId10"/>
                     <a:stretch>
                       <a:fillRect/>
                     </a:stretch>
@@ -805,7 +805,43 @@
         <w:rPr>
           <w:rFonts w:ascii="Arial" w:eastAsia="Arial" w:hAnsi="Arial" w:cs="Arial"/>
         </w:rPr>
-        <w:t>Desarrolle en Python el mismo programa pero utilizando fork() en lugar de Process.</w:t>
+        <w:t xml:space="preserve">Desarrolle en Python el mismo programa pero utilizando </w:t>
+      </w:r>
+      <w:proofErr w:type="spellStart"/>
+      <w:proofErr w:type="gramStart"/>
+      <w:r>
+        <w:rPr>
+          <w:rFonts w:ascii="Arial" w:eastAsia="Arial" w:hAnsi="Arial" w:cs="Arial"/>
+        </w:rPr>
+        <w:t>fork</w:t>
+      </w:r>
+      <w:proofErr w:type="spellEnd"/>
+      <w:r>
+        <w:rPr>
+          <w:rFonts w:ascii="Arial" w:eastAsia="Arial" w:hAnsi="Arial" w:cs="Arial"/>
+        </w:rPr>
+        <w:t>(</w:t>
+      </w:r>
+      <w:proofErr w:type="gramEnd"/>
+      <w:r>
+        <w:rPr>
+          <w:rFonts w:ascii="Arial" w:eastAsia="Arial" w:hAnsi="Arial" w:cs="Arial"/>
+        </w:rPr>
+        <w:t xml:space="preserve">) en lugar de </w:t>
+      </w:r>
+      <w:proofErr w:type="spellStart"/>
+      <w:r>
+        <w:rPr>
+          <w:rFonts w:ascii="Arial" w:eastAsia="Arial" w:hAnsi="Arial" w:cs="Arial"/>
+        </w:rPr>
+        <w:t>Process</w:t>
+      </w:r>
+      <w:proofErr w:type="spellEnd"/>
+      <w:r>
+        <w:rPr>
+          <w:rFonts w:ascii="Arial" w:eastAsia="Arial" w:hAnsi="Arial" w:cs="Arial"/>
+        </w:rPr>
+        <w:t>.</w:t>
       </w:r>
     </w:p>
     <w:p>
@@ -838,7 +874,7 @@
                     <pic:cNvPicPr/>
                   </pic:nvPicPr>
                   <pic:blipFill>
-                    <a:blip r:embed="rId9"/>
+                    <a:blip r:embed="rId11"/>
                     <a:stretch>
                       <a:fillRect/>
                     </a:stretch>
@@ -1012,7 +1048,43 @@
         <w:rPr>
           <w:lang w:val="es-ES"/>
         </w:rPr>
-        <w:t>Explicar que hace el código fuente y reemplazar la funcionalidad de Process por Fork()</w:t>
+        <w:t xml:space="preserve">Explicar que hace el código fuente y reemplazar la funcionalidad de </w:t>
+      </w:r>
+      <w:proofErr w:type="spellStart"/>
+      <w:r>
+        <w:rPr>
+          <w:lang w:val="es-ES"/>
+        </w:rPr>
+        <w:t>Process</w:t>
+      </w:r>
+      <w:proofErr w:type="spellEnd"/>
+      <w:r>
+        <w:rPr>
+          <w:lang w:val="es-ES"/>
+        </w:rPr>
+        <w:t xml:space="preserve"> por </w:t>
+      </w:r>
+      <w:proofErr w:type="spellStart"/>
+      <w:proofErr w:type="gramStart"/>
+      <w:r>
+        <w:rPr>
+          <w:lang w:val="es-ES"/>
+        </w:rPr>
+        <w:t>Fork</w:t>
+      </w:r>
+      <w:proofErr w:type="spellEnd"/>
+      <w:r>
+        <w:rPr>
+          <w:lang w:val="es-ES"/>
+        </w:rPr>
+        <w:t>(</w:t>
+      </w:r>
+      <w:proofErr w:type="gramEnd"/>
+      <w:r>
+        <w:rPr>
+          <w:lang w:val="es-ES"/>
+        </w:rPr>
+        <w:t>)</w:t>
       </w:r>
     </w:p>
     <w:p>
@@ -1203,6 +1275,7 @@
         <w:rPr>
           <w:b/>
           <w:bCs/>
+          <w:noProof/>
           <w:lang w:val="es-ES"/>
         </w:rPr>
         <w:lastRenderedPageBreak/>
@@ -1222,7 +1295,7 @@
                     <pic:cNvPicPr/>
                   </pic:nvPicPr>
                   <pic:blipFill>
-                    <a:blip r:embed="rId10"/>
+                    <a:blip r:embed="rId12"/>
                     <a:stretch>
                       <a:fillRect/>
                     </a:stretch>
@@ -1251,6 +1324,7 @@
       </w:r>
       <w:r>
         <w:rPr>
+          <w:noProof/>
           <w:lang w:val="es-ES"/>
         </w:rPr>
         <w:lastRenderedPageBreak/>
@@ -1270,7 +1344,7 @@
                     <pic:cNvPicPr/>
                   </pic:nvPicPr>
                   <pic:blipFill>
-                    <a:blip r:embed="rId11"/>
+                    <a:blip r:embed="rId13"/>
                     <a:stretch>
                       <a:fillRect/>
                     </a:stretch>
@@ -1341,7 +1415,21 @@
         <w:rPr>
           <w:rFonts w:ascii="Arial" w:eastAsia="Arial" w:hAnsi="Arial" w:cs="Arial"/>
         </w:rPr>
-        <w:t xml:space="preserve">La mansión Derceto, construida en el año 1818, es una conocida fuente de actividad paranormal y fenómenos inexplicables. Los famosos investigadores paranormales Ed y Lorraine Warren han sido convocados para investigar la mansión. La pareja lo contrata a usted, experto en programación concurrente, para realizar un programa que pueda monitorear sus múltiples cámaras de última generación y reportar cualquier tipo de actividad extraña. A continuación se citan las especificaciones de diseño: </w:t>
+        <w:t xml:space="preserve">La mansión </w:t>
+      </w:r>
+      <w:proofErr w:type="spellStart"/>
+      <w:r>
+        <w:rPr>
+          <w:rFonts w:ascii="Arial" w:eastAsia="Arial" w:hAnsi="Arial" w:cs="Arial"/>
+        </w:rPr>
+        <w:t>Derceto</w:t>
+      </w:r>
+      <w:proofErr w:type="spellEnd"/>
+      <w:r>
+        <w:rPr>
+          <w:rFonts w:ascii="Arial" w:eastAsia="Arial" w:hAnsi="Arial" w:cs="Arial"/>
+        </w:rPr>
+        <w:t xml:space="preserve">, construida en el año 1818, es una conocida fuente de actividad paranormal y fenómenos inexplicables. Los famosos investigadores paranormales Ed y Lorraine Warren han sido convocados para investigar la mansión. La pareja lo contrata a usted, experto en programación concurrente, para realizar un programa que pueda monitorear sus múltiples cámaras de última generación y reportar cualquier tipo de actividad extraña. A continuación se citan las especificaciones de diseño: </w:t>
       </w:r>
     </w:p>
     <w:p>
@@ -1787,6 +1875,7 @@
           <w:lang w:val="es-ES"/>
         </w:rPr>
       </w:pPr>
+      <w:bookmarkStart w:id="3" w:name="_Hlk207101967"/>
       <w:r>
         <w:rPr>
           <w:b/>
@@ -1985,7 +2074,7 @@
         <w:rPr>
           <w:rFonts w:ascii="Arial" w:eastAsia="Arial" w:hAnsi="Arial" w:cs="Arial"/>
         </w:rPr>
-        <w:t xml:space="preserve">Ático Año 2025 Universidad Nacional de La Matanza Programación Concurrente </w:t>
+        <w:t xml:space="preserve">Ático </w:t>
       </w:r>
     </w:p>
     <w:p>
@@ -2306,10 +2395,10 @@
         <w:rPr>
           <w:rFonts w:ascii="Arial" w:eastAsia="Arial" w:hAnsi="Arial" w:cs="Arial"/>
         </w:rPr>
-        <w:lastRenderedPageBreak/>
         <w:t xml:space="preserve">A fin de realizar la prueba del programa, genere aleatoriamente los EVENTOS en cada cámara, queda a criterio del grupo la probabilidad de ocurrencia de cada EVENTO. </w:t>
       </w:r>
     </w:p>
+    <w:bookmarkEnd w:id="3"/>
     <w:p>
       <w:pPr>
         <w:pStyle w:val="Ttulo2"/>
@@ -2390,7 +2479,23 @@
           <w:color w:val="auto"/>
           <w:lang w:val="es-ES"/>
         </w:rPr>
-        <w:t>Hubo que refinarlo con 2 iteraciones donde lo corrigió automaticamente.</w:t>
+        <w:t xml:space="preserve">Hubo que refinarlo con 2 iteraciones donde lo corrigió </w:t>
+      </w:r>
+      <w:proofErr w:type="spellStart"/>
+      <w:r>
+        <w:rPr>
+          <w:color w:val="auto"/>
+          <w:lang w:val="es-ES"/>
+        </w:rPr>
+        <w:t>automaticamente</w:t>
+      </w:r>
+      <w:proofErr w:type="spellEnd"/>
+      <w:r>
+        <w:rPr>
+          <w:color w:val="auto"/>
+          <w:lang w:val="es-ES"/>
+        </w:rPr>
+        <w:t>.</w:t>
       </w:r>
     </w:p>
     <w:p>
@@ -2440,24 +2545,41 @@
           <w:color w:val="auto"/>
           <w:lang w:val="es-ES"/>
         </w:rPr>
-        <w:t xml:space="preserve">, un manual de usuario y un archivo de prueba </w:t>
-      </w:r>
+        <w:t xml:space="preserve">, un manual de usuario y un archivo de </w:t>
+      </w:r>
+      <w:proofErr w:type="gramStart"/>
       <w:r>
         <w:rPr>
           <w:color w:val="auto"/>
           <w:lang w:val="es-ES"/>
         </w:rPr>
-        <w:t xml:space="preserve"> con el siguiente output por pantalla:</w:t>
+        <w:t xml:space="preserve">prueba </w:t>
       </w:r>
       <w:r>
         <w:rPr>
           <w:color w:val="auto"/>
           <w:lang w:val="es-ES"/>
         </w:rPr>
+        <w:t xml:space="preserve"> con</w:t>
+      </w:r>
+      <w:proofErr w:type="gramEnd"/>
+      <w:r>
+        <w:rPr>
+          <w:color w:val="auto"/>
+          <w:lang w:val="es-ES"/>
+        </w:rPr>
+        <w:t xml:space="preserve"> el siguiente output por pantalla:</w:t>
+      </w:r>
+      <w:r>
+        <w:rPr>
+          <w:color w:val="auto"/>
+          <w:lang w:val="es-ES"/>
+        </w:rPr>
         <w:br/>
       </w:r>
       <w:r>
         <w:rPr>
+          <w:noProof/>
           <w:lang w:val="es-ES"/>
         </w:rPr>
         <w:drawing>
@@ -2476,7 +2598,7 @@
                     <pic:cNvPicPr/>
                   </pic:nvPicPr>
                   <pic:blipFill>
-                    <a:blip r:embed="rId12"/>
+                    <a:blip r:embed="rId14"/>
                     <a:stretch>
                       <a:fillRect/>
                     </a:stretch>
@@ -2505,6 +2627,7 @@
       </w:r>
       <w:r>
         <w:rPr>
+          <w:noProof/>
           <w:lang w:val="es-ES"/>
         </w:rPr>
         <w:drawing>
@@ -2523,7 +2646,7 @@
                     <pic:cNvPicPr/>
                   </pic:nvPicPr>
                   <pic:blipFill>
-                    <a:blip r:embed="rId13"/>
+                    <a:blip r:embed="rId15"/>
                     <a:stretch>
                       <a:fillRect/>
                     </a:stretch>
@@ -2558,9 +2681,12 @@
           <w:numId w:val="15"/>
         </w:numPr>
         <w:rPr>
-          <w:lang w:val="es-ES"/>
-        </w:rPr>
-      </w:pPr>
+          <w:b/>
+          <w:bCs/>
+          <w:lang w:val="es-ES"/>
+        </w:rPr>
+      </w:pPr>
+      <w:proofErr w:type="spellStart"/>
       <w:r>
         <w:rPr>
           <w:b/>
@@ -2568,7 +2694,159 @@
           <w:lang w:val="es-ES"/>
         </w:rPr>
         <w:lastRenderedPageBreak/>
-        <w:t>GPT</w:t>
+        <w:t>GithubCopilot</w:t>
+      </w:r>
+      <w:proofErr w:type="spellEnd"/>
+    </w:p>
+    <w:p>
+      <w:pPr>
+        <w:rPr>
+          <w:lang w:val="es-ES"/>
+        </w:rPr>
+      </w:pPr>
+      <w:r>
+        <w:rPr>
+          <w:noProof/>
+        </w:rPr>
+        <w:drawing>
+          <wp:inline distT="0" distB="0" distL="0" distR="0" wp14:anchorId="6DDA9ABB" wp14:editId="79D3ABDA">
+            <wp:extent cx="5400040" cy="3804285"/>
+            <wp:effectExtent l="0" t="0" r="0" b="5715"/>
+            <wp:docPr id="1" name="Imagen 1"/>
+            <wp:cNvGraphicFramePr>
+              <a:graphicFrameLocks xmlns:a="http://schemas.openxmlformats.org/drawingml/2006/main" noChangeAspect="1"/>
+            </wp:cNvGraphicFramePr>
+            <a:graphic xmlns:a="http://schemas.openxmlformats.org/drawingml/2006/main">
+              <a:graphicData uri="http://schemas.openxmlformats.org/drawingml/2006/picture">
+                <pic:pic xmlns:pic="http://schemas.openxmlformats.org/drawingml/2006/picture">
+                  <pic:nvPicPr>
+                    <pic:cNvPr id="1" name=""/>
+                    <pic:cNvPicPr/>
+                  </pic:nvPicPr>
+                  <pic:blipFill>
+                    <a:blip r:embed="rId16"/>
+                    <a:stretch>
+                      <a:fillRect/>
+                    </a:stretch>
+                  </pic:blipFill>
+                  <pic:spPr>
+                    <a:xfrm>
+                      <a:off x="0" y="0"/>
+                      <a:ext cx="5400040" cy="3804285"/>
+                    </a:xfrm>
+                    <a:prstGeom prst="rect">
+                      <a:avLst/>
+                    </a:prstGeom>
+                  </pic:spPr>
+                </pic:pic>
+              </a:graphicData>
+            </a:graphic>
+          </wp:inline>
+        </w:drawing>
+      </w:r>
+    </w:p>
+    <w:p>
+      <w:pPr>
+        <w:rPr>
+          <w:lang w:val="es-ES"/>
+        </w:rPr>
+      </w:pPr>
+    </w:p>
+    <w:p>
+      <w:pPr>
+        <w:rPr>
+          <w:lang w:val="es-ES"/>
+        </w:rPr>
+      </w:pPr>
+      <w:r>
+        <w:rPr>
+          <w:lang w:val="es-ES"/>
+        </w:rPr>
+        <w:t>El programa funciona de manera correcta en la primera iteración.</w:t>
+      </w:r>
+    </w:p>
+    <w:p>
+      <w:pPr>
+        <w:pStyle w:val="Ttulo2"/>
+        <w:numPr>
+          <w:ilvl w:val="0"/>
+          <w:numId w:val="15"/>
+        </w:numPr>
+        <w:rPr>
+          <w:lang w:val="es-ES"/>
+        </w:rPr>
+      </w:pPr>
+      <w:proofErr w:type="spellStart"/>
+      <w:r>
+        <w:rPr>
+          <w:b/>
+          <w:bCs/>
+          <w:lang w:val="es-ES"/>
+        </w:rPr>
+        <w:lastRenderedPageBreak/>
+        <w:t>Windowsruf</w:t>
+      </w:r>
+      <w:proofErr w:type="spellEnd"/>
+    </w:p>
+    <w:p>
+      <w:pPr>
+        <w:pStyle w:val="Prrafodelista"/>
+        <w:rPr>
+          <w:lang w:val="es-ES"/>
+        </w:rPr>
+      </w:pPr>
+      <w:r>
+        <w:rPr>
+          <w:noProof/>
+        </w:rPr>
+        <w:drawing>
+          <wp:inline distT="0" distB="0" distL="0" distR="0" wp14:anchorId="2FEF9E87" wp14:editId="3A105F8D">
+            <wp:extent cx="5400040" cy="4394200"/>
+            <wp:effectExtent l="0" t="0" r="0" b="6350"/>
+            <wp:docPr id="2" name="Imagen 2"/>
+            <wp:cNvGraphicFramePr>
+              <a:graphicFrameLocks xmlns:a="http://schemas.openxmlformats.org/drawingml/2006/main" noChangeAspect="1"/>
+            </wp:cNvGraphicFramePr>
+            <a:graphic xmlns:a="http://schemas.openxmlformats.org/drawingml/2006/main">
+              <a:graphicData uri="http://schemas.openxmlformats.org/drawingml/2006/picture">
+                <pic:pic xmlns:pic="http://schemas.openxmlformats.org/drawingml/2006/picture">
+                  <pic:nvPicPr>
+                    <pic:cNvPr id="1" name=""/>
+                    <pic:cNvPicPr/>
+                  </pic:nvPicPr>
+                  <pic:blipFill>
+                    <a:blip r:embed="rId17"/>
+                    <a:stretch>
+                      <a:fillRect/>
+                    </a:stretch>
+                  </pic:blipFill>
+                  <pic:spPr>
+                    <a:xfrm>
+                      <a:off x="0" y="0"/>
+                      <a:ext cx="5400040" cy="4394200"/>
+                    </a:xfrm>
+                    <a:prstGeom prst="rect">
+                      <a:avLst/>
+                    </a:prstGeom>
+                  </pic:spPr>
+                </pic:pic>
+              </a:graphicData>
+            </a:graphic>
+          </wp:inline>
+        </w:drawing>
+      </w:r>
+    </w:p>
+    <w:p>
+      <w:pPr>
+        <w:rPr>
+          <w:lang w:val="es-ES"/>
+        </w:rPr>
+      </w:pPr>
+      <w:r>
+        <w:rPr>
+          <w:lang w:val="es-ES"/>
+        </w:rPr>
+        <w:t>El programa funciona de manera correcta en la primera iteración.</w:t>
       </w:r>
     </w:p>
     <w:p>
@@ -2588,8 +2866,58 @@
 </w:document>
 </file>
 
+<file path=word/endnotes.xml><?xml version="1.0" encoding="utf-8"?>
+<w:endnotes xmlns:wpc="http://schemas.microsoft.com/office/word/2010/wordprocessingCanvas" xmlns:cx="http://schemas.microsoft.com/office/drawing/2014/chartex" xmlns:cx1="http://schemas.microsoft.com/office/drawing/2015/9/8/chartex" xmlns:cx2="http://schemas.microsoft.com/office/drawing/2015/10/21/chartex" xmlns:cx3="http://schemas.microsoft.com/office/drawing/2016/5/9/chartex" xmlns:cx4="http://schemas.microsoft.com/office/drawing/2016/5/10/chartex" xmlns:cx5="http://schemas.microsoft.com/office/drawing/2016/5/11/chartex" xmlns:cx6="http://schemas.microsoft.com/office/drawing/2016/5/12/chartex" xmlns:cx7="http://schemas.microsoft.com/office/drawing/2016/5/13/chartex" xmlns:cx8="http://schemas.microsoft.com/office/drawing/2016/5/14/chartex" xmlns:mc="http://schemas.openxmlformats.org/markup-compatibility/2006" xmlns:aink="http://schemas.microsoft.com/office/drawing/2016/ink" xmlns:am3d="http://schemas.microsoft.com/office/drawing/2017/model3d" xmlns:o="urn:schemas-microsoft-com:office:office" xmlns:r="http://schemas.openxmlformats.org/officeDocument/2006/relationships" xmlns:m="http://schemas.openxmlformats.org/officeDocument/2006/math" xmlns:v="urn:schemas-microsoft-com:vml" xmlns:wp14="http://schemas.microsoft.com/office/word/2010/wordprocessingDrawing" xmlns:wp="http://schemas.openxmlformats.org/drawingml/2006/wordprocessingDrawing" xmlns:w10="urn:schemas-microsoft-com:office:word" xmlns:w="http://schemas.openxmlformats.org/wordprocessingml/2006/main" xmlns:w14="http://schemas.microsoft.com/office/word/2010/wordml" xmlns:w15="http://schemas.microsoft.com/office/word/2012/wordml" xmlns:w16cex="http://schemas.microsoft.com/office/word/2018/wordml/cex" xmlns:w16cid="http://schemas.microsoft.com/office/word/2016/wordml/cid" xmlns:w16="http://schemas.microsoft.com/office/word/2018/wordml" xmlns:w16sdtdh="http://schemas.microsoft.com/office/word/2020/wordml/sdtdatahash" xmlns:w16se="http://schemas.microsoft.com/office/word/2015/wordml/symex" xmlns:wpg="http://schemas.microsoft.com/office/word/2010/wordprocessingGroup" xmlns:wpi="http://schemas.microsoft.com/office/word/2010/wordprocessingInk" xmlns:wne="http://schemas.microsoft.com/office/word/2006/wordml" xmlns:wps="http://schemas.microsoft.com/office/word/2010/wordprocessingShape" mc:Ignorable="w14 w15 w16se w16cid w16 w16cex w16sdtdh wp14">
+  <w:endnote w:type="separator" w:id="-1">
+    <w:p>
+      <w:pPr>
+        <w:spacing w:after="0" w:line="240" w:lineRule="auto"/>
+      </w:pPr>
+      <w:r>
+        <w:separator/>
+      </w:r>
+    </w:p>
+  </w:endnote>
+  <w:endnote w:type="continuationSeparator" w:id="0">
+    <w:p>
+      <w:pPr>
+        <w:spacing w:after="0" w:line="240" w:lineRule="auto"/>
+      </w:pPr>
+      <w:r>
+        <w:continuationSeparator/>
+      </w:r>
+    </w:p>
+  </w:endnote>
+</w:endnotes>
+</file>
+
+<file path=word/footnotes.xml><?xml version="1.0" encoding="utf-8"?>
+<w:footnotes xmlns:wpc="http://schemas.microsoft.com/office/word/2010/wordprocessingCanvas" xmlns:cx="http://schemas.microsoft.com/office/drawing/2014/chartex" xmlns:cx1="http://schemas.microsoft.com/office/drawing/2015/9/8/chartex" xmlns:cx2="http://schemas.microsoft.com/office/drawing/2015/10/21/chartex" xmlns:cx3="http://schemas.microsoft.com/office/drawing/2016/5/9/chartex" xmlns:cx4="http://schemas.microsoft.com/office/drawing/2016/5/10/chartex" xmlns:cx5="http://schemas.microsoft.com/office/drawing/2016/5/11/chartex" xmlns:cx6="http://schemas.microsoft.com/office/drawing/2016/5/12/chartex" xmlns:cx7="http://schemas.microsoft.com/office/drawing/2016/5/13/chartex" xmlns:cx8="http://schemas.microsoft.com/office/drawing/2016/5/14/chartex" xmlns:mc="http://schemas.openxmlformats.org/markup-compatibility/2006" xmlns:aink="http://schemas.microsoft.com/office/drawing/2016/ink" xmlns:am3d="http://schemas.microsoft.com/office/drawing/2017/model3d" xmlns:o="urn:schemas-microsoft-com:office:office" xmlns:r="http://schemas.openxmlformats.org/officeDocument/2006/relationships" xmlns:m="http://schemas.openxmlformats.org/officeDocument/2006/math" xmlns:v="urn:schemas-microsoft-com:vml" xmlns:wp14="http://schemas.microsoft.com/office/word/2010/wordprocessingDrawing" xmlns:wp="http://schemas.openxmlformats.org/drawingml/2006/wordprocessingDrawing" xmlns:w10="urn:schemas-microsoft-com:office:word" xmlns:w="http://schemas.openxmlformats.org/wordprocessingml/2006/main" xmlns:w14="http://schemas.microsoft.com/office/word/2010/wordml" xmlns:w15="http://schemas.microsoft.com/office/word/2012/wordml" xmlns:w16cex="http://schemas.microsoft.com/office/word/2018/wordml/cex" xmlns:w16cid="http://schemas.microsoft.com/office/word/2016/wordml/cid" xmlns:w16="http://schemas.microsoft.com/office/word/2018/wordml" xmlns:w16sdtdh="http://schemas.microsoft.com/office/word/2020/wordml/sdtdatahash" xmlns:w16se="http://schemas.microsoft.com/office/word/2015/wordml/symex" xmlns:wpg="http://schemas.microsoft.com/office/word/2010/wordprocessingGroup" xmlns:wpi="http://schemas.microsoft.com/office/word/2010/wordprocessingInk" xmlns:wne="http://schemas.microsoft.com/office/word/2006/wordml" xmlns:wps="http://schemas.microsoft.com/office/word/2010/wordprocessingShape" mc:Ignorable="w14 w15 w16se w16cid w16 w16cex w16sdtdh wp14">
+  <w:footnote w:type="separator" w:id="-1">
+    <w:p>
+      <w:pPr>
+        <w:spacing w:after="0" w:line="240" w:lineRule="auto"/>
+      </w:pPr>
+      <w:r>
+        <w:separator/>
+      </w:r>
+    </w:p>
+  </w:footnote>
+  <w:footnote w:type="continuationSeparator" w:id="0">
+    <w:p>
+      <w:pPr>
+        <w:spacing w:after="0" w:line="240" w:lineRule="auto"/>
+      </w:pPr>
+      <w:r>
+        <w:continuationSeparator/>
+      </w:r>
+    </w:p>
+  </w:footnote>
+</w:footnotes>
+</file>
+
 <file path=word/numbering.xml><?xml version="1.0" encoding="utf-8"?>
-<w:numbering xmlns:wpc="http://schemas.microsoft.com/office/word/2010/wordprocessingCanvas" xmlns:cx="http://schemas.microsoft.com/office/drawing/2014/chartex" xmlns:cx1="http://schemas.microsoft.com/office/drawing/2015/9/8/chartex" xmlns:cx2="http://schemas.microsoft.com/office/drawing/2015/10/21/chartex" xmlns:cx3="http://schemas.microsoft.com/office/drawing/2016/5/9/chartex" xmlns:cx4="http://schemas.microsoft.com/office/drawing/2016/5/10/chartex" xmlns:cx5="http://schemas.microsoft.com/office/drawing/2016/5/11/chartex" xmlns:cx6="http://schemas.microsoft.com/office/drawing/2016/5/12/chartex" xmlns:cx7="http://schemas.microsoft.com/office/drawing/2016/5/13/chartex" xmlns:cx8="http://schemas.microsoft.com/office/drawing/2016/5/14/chartex" xmlns:mc="http://schemas.openxmlformats.org/markup-compatibility/2006" xmlns:aink="http://schemas.microsoft.com/office/drawing/2016/ink" xmlns:am3d="http://schemas.microsoft.com/office/drawing/2017/model3d" xmlns:o="urn:schemas-microsoft-com:office:office" xmlns:oel="http://schemas.microsoft.com/office/2019/extlst" xmlns:r="http://schemas.openxmlformats.org/officeDocument/2006/relationships" xmlns:m="http://schemas.openxmlformats.org/officeDocument/2006/math" xmlns:v="urn:schemas-microsoft-com:vml" xmlns:wp14="http://schemas.microsoft.com/office/word/2010/wordprocessingDrawing" xmlns:wp="http://schemas.openxmlformats.org/drawingml/2006/wordprocessingDrawing" xmlns:w10="urn:schemas-microsoft-com:office:word" xmlns:w="http://schemas.openxmlformats.org/wordprocessingml/2006/main" xmlns:w14="http://schemas.microsoft.com/office/word/2010/wordml" xmlns:w15="http://schemas.microsoft.com/office/word/2012/wordml" xmlns:w16cex="http://schemas.microsoft.com/office/word/2018/wordml/cex" xmlns:w16cid="http://schemas.microsoft.com/office/word/2016/wordml/cid" xmlns:w16="http://schemas.microsoft.com/office/word/2018/wordml" xmlns:w16du="http://schemas.microsoft.com/office/word/2023/wordml/word16du" xmlns:w16sdtdh="http://schemas.microsoft.com/office/word/2020/wordml/sdtdatahash" xmlns:w16sdtfl="http://schemas.microsoft.com/office/word/2024/wordml/sdtformatlock" xmlns:w16se="http://schemas.microsoft.com/office/word/2015/wordml/symex" xmlns:wpg="http://schemas.microsoft.com/office/word/2010/wordprocessingGroup" xmlns:wpi="http://schemas.microsoft.com/office/word/2010/wordprocessingInk" xmlns:wne="http://schemas.microsoft.com/office/word/2006/wordml" xmlns:wps="http://schemas.microsoft.com/office/word/2010/wordprocessingShape" mc:Ignorable="w14 w15 w16se w16cid w16 w16cex w16sdtdh w16sdtfl w16du wp14">
+<w:numbering xmlns:wpc="http://schemas.microsoft.com/office/word/2010/wordprocessingCanvas" xmlns:cx="http://schemas.microsoft.com/office/drawing/2014/chartex" xmlns:cx1="http://schemas.microsoft.com/office/drawing/2015/9/8/chartex" xmlns:cx2="http://schemas.microsoft.com/office/drawing/2015/10/21/chartex" xmlns:cx3="http://schemas.microsoft.com/office/drawing/2016/5/9/chartex" xmlns:cx4="http://schemas.microsoft.com/office/drawing/2016/5/10/chartex" xmlns:cx5="http://schemas.microsoft.com/office/drawing/2016/5/11/chartex" xmlns:cx6="http://schemas.microsoft.com/office/drawing/2016/5/12/chartex" xmlns:cx7="http://schemas.microsoft.com/office/drawing/2016/5/13/chartex" xmlns:cx8="http://schemas.microsoft.com/office/drawing/2016/5/14/chartex" xmlns:mc="http://schemas.openxmlformats.org/markup-compatibility/2006" xmlns:aink="http://schemas.microsoft.com/office/drawing/2016/ink" xmlns:am3d="http://schemas.microsoft.com/office/drawing/2017/model3d" xmlns:o="urn:schemas-microsoft-com:office:office" xmlns:r="http://schemas.openxmlformats.org/officeDocument/2006/relationships" xmlns:m="http://schemas.openxmlformats.org/officeDocument/2006/math" xmlns:v="urn:schemas-microsoft-com:vml" xmlns:wp14="http://schemas.microsoft.com/office/word/2010/wordprocessingDrawing" xmlns:wp="http://schemas.openxmlformats.org/drawingml/2006/wordprocessingDrawing" xmlns:w10="urn:schemas-microsoft-com:office:word" xmlns:w="http://schemas.openxmlformats.org/wordprocessingml/2006/main" xmlns:w14="http://schemas.microsoft.com/office/word/2010/wordml" xmlns:w15="http://schemas.microsoft.com/office/word/2012/wordml" xmlns:w16cex="http://schemas.microsoft.com/office/word/2018/wordml/cex" xmlns:w16cid="http://schemas.microsoft.com/office/word/2016/wordml/cid" xmlns:w16="http://schemas.microsoft.com/office/word/2018/wordml" xmlns:w16sdtdh="http://schemas.microsoft.com/office/word/2020/wordml/sdtdatahash" xmlns:w16se="http://schemas.microsoft.com/office/word/2015/wordml/symex" xmlns:wpg="http://schemas.microsoft.com/office/word/2010/wordprocessingGroup" xmlns:wpi="http://schemas.microsoft.com/office/word/2010/wordprocessingInk" xmlns:wne="http://schemas.microsoft.com/office/word/2006/wordml" xmlns:wps="http://schemas.microsoft.com/office/word/2010/wordprocessingShape" mc:Ignorable="w14 w15 w16se w16cid w16 w16cex w16sdtdh wp14">
   <w:abstractNum w:abstractNumId="0" w15:restartNumberingAfterBreak="0">
     <w:nsid w:val="06F33E16"/>
     <w:multiLevelType w:val="hybridMultilevel"/>
@@ -3477,6 +3805,119 @@
     </w:lvl>
   </w:abstractNum>
   <w:abstractNum w:abstractNumId="9" w15:restartNumberingAfterBreak="0">
+    <w:nsid w:val="4C0A5CB8"/>
+    <w:multiLevelType w:val="hybridMultilevel"/>
+    <w:tmpl w:val="A7A61BBC"/>
+    <w:lvl w:ilvl="0" w:tplc="2C0A0001">
+      <w:start w:val="1"/>
+      <w:numFmt w:val="bullet"/>
+      <w:lvlText w:val=""/>
+      <w:lvlJc w:val="left"/>
+      <w:pPr>
+        <w:ind w:left="720" w:hanging="360"/>
+      </w:pPr>
+      <w:rPr>
+        <w:rFonts w:ascii="Symbol" w:hAnsi="Symbol" w:hint="default"/>
+      </w:rPr>
+    </w:lvl>
+    <w:lvl w:ilvl="1" w:tplc="2C0A0003" w:tentative="1">
+      <w:start w:val="1"/>
+      <w:numFmt w:val="bullet"/>
+      <w:lvlText w:val="o"/>
+      <w:lvlJc w:val="left"/>
+      <w:pPr>
+        <w:ind w:left="1440" w:hanging="360"/>
+      </w:pPr>
+      <w:rPr>
+        <w:rFonts w:ascii="Courier New" w:hAnsi="Courier New" w:cs="Courier New" w:hint="default"/>
+      </w:rPr>
+    </w:lvl>
+    <w:lvl w:ilvl="2" w:tplc="2C0A0005" w:tentative="1">
+      <w:start w:val="1"/>
+      <w:numFmt w:val="bullet"/>
+      <w:lvlText w:val=""/>
+      <w:lvlJc w:val="left"/>
+      <w:pPr>
+        <w:ind w:left="2160" w:hanging="360"/>
+      </w:pPr>
+      <w:rPr>
+        <w:rFonts w:ascii="Wingdings" w:hAnsi="Wingdings" w:hint="default"/>
+      </w:rPr>
+    </w:lvl>
+    <w:lvl w:ilvl="3" w:tplc="2C0A0001" w:tentative="1">
+      <w:start w:val="1"/>
+      <w:numFmt w:val="bullet"/>
+      <w:lvlText w:val=""/>
+      <w:lvlJc w:val="left"/>
+      <w:pPr>
+        <w:ind w:left="2880" w:hanging="360"/>
+      </w:pPr>
+      <w:rPr>
+        <w:rFonts w:ascii="Symbol" w:hAnsi="Symbol" w:hint="default"/>
+      </w:rPr>
+    </w:lvl>
+    <w:lvl w:ilvl="4" w:tplc="2C0A0003" w:tentative="1">
+      <w:start w:val="1"/>
+      <w:numFmt w:val="bullet"/>
+      <w:lvlText w:val="o"/>
+      <w:lvlJc w:val="left"/>
+      <w:pPr>
+        <w:ind w:left="3600" w:hanging="360"/>
+      </w:pPr>
+      <w:rPr>
+        <w:rFonts w:ascii="Courier New" w:hAnsi="Courier New" w:cs="Courier New" w:hint="default"/>
+      </w:rPr>
+    </w:lvl>
+    <w:lvl w:ilvl="5" w:tplc="2C0A0005" w:tentative="1">
+      <w:start w:val="1"/>
+      <w:numFmt w:val="bullet"/>
+      <w:lvlText w:val=""/>
+      <w:lvlJc w:val="left"/>
+      <w:pPr>
+        <w:ind w:left="4320" w:hanging="360"/>
+      </w:pPr>
+      <w:rPr>
+        <w:rFonts w:ascii="Wingdings" w:hAnsi="Wingdings" w:hint="default"/>
+      </w:rPr>
+    </w:lvl>
+    <w:lvl w:ilvl="6" w:tplc="2C0A0001" w:tentative="1">
+      <w:start w:val="1"/>
+      <w:numFmt w:val="bullet"/>
+      <w:lvlText w:val=""/>
+      <w:lvlJc w:val="left"/>
+      <w:pPr>
+        <w:ind w:left="5040" w:hanging="360"/>
+      </w:pPr>
+      <w:rPr>
+        <w:rFonts w:ascii="Symbol" w:hAnsi="Symbol" w:hint="default"/>
+      </w:rPr>
+    </w:lvl>
+    <w:lvl w:ilvl="7" w:tplc="2C0A0003" w:tentative="1">
+      <w:start w:val="1"/>
+      <w:numFmt w:val="bullet"/>
+      <w:lvlText w:val="o"/>
+      <w:lvlJc w:val="left"/>
+      <w:pPr>
+        <w:ind w:left="5760" w:hanging="360"/>
+      </w:pPr>
+      <w:rPr>
+        <w:rFonts w:ascii="Courier New" w:hAnsi="Courier New" w:cs="Courier New" w:hint="default"/>
+      </w:rPr>
+    </w:lvl>
+    <w:lvl w:ilvl="8" w:tplc="2C0A0005" w:tentative="1">
+      <w:start w:val="1"/>
+      <w:numFmt w:val="bullet"/>
+      <w:lvlText w:val=""/>
+      <w:lvlJc w:val="left"/>
+      <w:pPr>
+        <w:ind w:left="6480" w:hanging="360"/>
+      </w:pPr>
+      <w:rPr>
+        <w:rFonts w:ascii="Wingdings" w:hAnsi="Wingdings" w:hint="default"/>
+      </w:rPr>
+    </w:lvl>
+  </w:abstractNum>
+  <w:abstractNum w:abstractNumId="10" w15:restartNumberingAfterBreak="0">
     <w:nsid w:val="568D227B"/>
     <w:multiLevelType w:val="hybridMultilevel"/>
     <w:tmpl w:val="050C07D8"/>
@@ -3562,7 +4003,7 @@
       </w:pPr>
     </w:lvl>
   </w:abstractNum>
-  <w:abstractNum w:abstractNumId="10" w15:restartNumberingAfterBreak="0">
+  <w:abstractNum w:abstractNumId="11" w15:restartNumberingAfterBreak="0">
     <w:nsid w:val="59891C0D"/>
     <w:multiLevelType w:val="hybridMultilevel"/>
     <w:tmpl w:val="927E8660"/>
@@ -3648,7 +4089,7 @@
       </w:pPr>
     </w:lvl>
   </w:abstractNum>
-  <w:abstractNum w:abstractNumId="11" w15:restartNumberingAfterBreak="0">
+  <w:abstractNum w:abstractNumId="12" w15:restartNumberingAfterBreak="0">
     <w:nsid w:val="5C446073"/>
     <w:multiLevelType w:val="hybridMultilevel"/>
     <w:tmpl w:val="B7F01D18"/>
@@ -3734,7 +4175,7 @@
       </w:pPr>
     </w:lvl>
   </w:abstractNum>
-  <w:abstractNum w:abstractNumId="12" w15:restartNumberingAfterBreak="0">
+  <w:abstractNum w:abstractNumId="13" w15:restartNumberingAfterBreak="0">
     <w:nsid w:val="75896048"/>
     <w:multiLevelType w:val="hybridMultilevel"/>
     <w:tmpl w:val="7BD88456"/>
@@ -3847,7 +4288,7 @@
       </w:rPr>
     </w:lvl>
   </w:abstractNum>
-  <w:abstractNum w:abstractNumId="13" w15:restartNumberingAfterBreak="0">
+  <w:abstractNum w:abstractNumId="14" w15:restartNumberingAfterBreak="0">
     <w:nsid w:val="7FF522AF"/>
     <w:multiLevelType w:val="hybridMultilevel"/>
     <w:tmpl w:val="8ECE02DC"/>
@@ -3960,59 +4401,62 @@
       </w:rPr>
     </w:lvl>
   </w:abstractNum>
-  <w:num w:numId="1" w16cid:durableId="1685668384">
+  <w:num w:numId="1">
     <w:abstractNumId w:val="7"/>
   </w:num>
-  <w:num w:numId="2" w16cid:durableId="1471367604">
+  <w:num w:numId="2">
     <w:abstractNumId w:val="3"/>
   </w:num>
-  <w:num w:numId="3" w16cid:durableId="1673216004">
+  <w:num w:numId="3">
     <w:abstractNumId w:val="3"/>
   </w:num>
-  <w:num w:numId="4" w16cid:durableId="649948346">
+  <w:num w:numId="4">
+    <w:abstractNumId w:val="14"/>
+  </w:num>
+  <w:num w:numId="5">
+    <w:abstractNumId w:val="2"/>
+  </w:num>
+  <w:num w:numId="6">
+    <w:abstractNumId w:val="2"/>
+  </w:num>
+  <w:num w:numId="7">
+    <w:abstractNumId w:val="11"/>
+  </w:num>
+  <w:num w:numId="8">
+    <w:abstractNumId w:val="5"/>
+  </w:num>
+  <w:num w:numId="9">
+    <w:abstractNumId w:val="12"/>
+  </w:num>
+  <w:num w:numId="10">
+    <w:abstractNumId w:val="10"/>
+  </w:num>
+  <w:num w:numId="11">
+    <w:abstractNumId w:val="0"/>
+  </w:num>
+  <w:num w:numId="12">
     <w:abstractNumId w:val="13"/>
   </w:num>
-  <w:num w:numId="5" w16cid:durableId="1106073141">
-    <w:abstractNumId w:val="2"/>
-  </w:num>
-  <w:num w:numId="6" w16cid:durableId="1623070959">
-    <w:abstractNumId w:val="2"/>
-  </w:num>
-  <w:num w:numId="7" w16cid:durableId="164833036">
-    <w:abstractNumId w:val="10"/>
-  </w:num>
-  <w:num w:numId="8" w16cid:durableId="190413842">
-    <w:abstractNumId w:val="5"/>
-  </w:num>
-  <w:num w:numId="9" w16cid:durableId="1847205874">
-    <w:abstractNumId w:val="11"/>
-  </w:num>
-  <w:num w:numId="10" w16cid:durableId="1485396521">
-    <w:abstractNumId w:val="9"/>
-  </w:num>
-  <w:num w:numId="11" w16cid:durableId="1680153340">
-    <w:abstractNumId w:val="0"/>
-  </w:num>
-  <w:num w:numId="12" w16cid:durableId="1426267720">
-    <w:abstractNumId w:val="12"/>
-  </w:num>
-  <w:num w:numId="13" w16cid:durableId="828908048">
+  <w:num w:numId="13">
     <w:abstractNumId w:val="8"/>
   </w:num>
-  <w:num w:numId="14" w16cid:durableId="388383032">
+  <w:num w:numId="14">
     <w:abstractNumId w:val="6"/>
   </w:num>
-  <w:num w:numId="15" w16cid:durableId="1352032066">
+  <w:num w:numId="15">
     <w:abstractNumId w:val="4"/>
   </w:num>
-  <w:num w:numId="16" w16cid:durableId="789129005">
+  <w:num w:numId="16">
     <w:abstractNumId w:val="1"/>
+  </w:num>
+  <w:num w:numId="17">
+    <w:abstractNumId w:val="9"/>
   </w:num>
 </w:numbering>
 </file>
 
 <file path=word/styles.xml><?xml version="1.0" encoding="utf-8"?>
-<w:styles xmlns:mc="http://schemas.openxmlformats.org/markup-compatibility/2006" xmlns:r="http://schemas.openxmlformats.org/officeDocument/2006/relationships" xmlns:w="http://schemas.openxmlformats.org/wordprocessingml/2006/main" xmlns:w14="http://schemas.microsoft.com/office/word/2010/wordml" xmlns:w15="http://schemas.microsoft.com/office/word/2012/wordml" xmlns:w16cex="http://schemas.microsoft.com/office/word/2018/wordml/cex" xmlns:w16cid="http://schemas.microsoft.com/office/word/2016/wordml/cid" xmlns:w16="http://schemas.microsoft.com/office/word/2018/wordml" xmlns:w16du="http://schemas.microsoft.com/office/word/2023/wordml/word16du" xmlns:w16sdtdh="http://schemas.microsoft.com/office/word/2020/wordml/sdtdatahash" xmlns:w16sdtfl="http://schemas.microsoft.com/office/word/2024/wordml/sdtformatlock" xmlns:w16se="http://schemas.microsoft.com/office/word/2015/wordml/symex" mc:Ignorable="w14 w15 w16se w16cid w16 w16cex w16sdtdh w16sdtfl w16du">
+<w:styles xmlns:mc="http://schemas.openxmlformats.org/markup-compatibility/2006" xmlns:r="http://schemas.openxmlformats.org/officeDocument/2006/relationships" xmlns:w="http://schemas.openxmlformats.org/wordprocessingml/2006/main" xmlns:w14="http://schemas.microsoft.com/office/word/2010/wordml" xmlns:w15="http://schemas.microsoft.com/office/word/2012/wordml" xmlns:w16cex="http://schemas.microsoft.com/office/word/2018/wordml/cex" xmlns:w16cid="http://schemas.microsoft.com/office/word/2016/wordml/cid" xmlns:w16="http://schemas.microsoft.com/office/word/2018/wordml" xmlns:w16sdtdh="http://schemas.microsoft.com/office/word/2020/wordml/sdtdatahash" xmlns:w16se="http://schemas.microsoft.com/office/word/2015/wordml/symex" mc:Ignorable="w14 w15 w16se w16cid w16 w16cex w16sdtdh">
   <w:docDefaults>
     <w:rPrDefault>
       <w:rPr>
@@ -4555,6 +4999,50 @@
       <w:u w:val="single"/>
     </w:rPr>
   </w:style>
+  <w:style w:type="paragraph" w:styleId="Encabezado">
+    <w:name w:val="header"/>
+    <w:basedOn w:val="Normal"/>
+    <w:link w:val="EncabezadoCar"/>
+    <w:uiPriority w:val="99"/>
+    <w:unhideWhenUsed/>
+    <w:rsid w:val="00B73C13"/>
+    <w:pPr>
+      <w:tabs>
+        <w:tab w:val="center" w:pos="4252"/>
+        <w:tab w:val="right" w:pos="8504"/>
+      </w:tabs>
+      <w:spacing w:after="0" w:line="240" w:lineRule="auto"/>
+    </w:pPr>
+  </w:style>
+  <w:style w:type="character" w:customStyle="1" w:styleId="EncabezadoCar">
+    <w:name w:val="Encabezado Car"/>
+    <w:basedOn w:val="Fuentedeprrafopredeter"/>
+    <w:link w:val="Encabezado"/>
+    <w:uiPriority w:val="99"/>
+    <w:rsid w:val="00B73C13"/>
+  </w:style>
+  <w:style w:type="paragraph" w:styleId="Piedepgina">
+    <w:name w:val="footer"/>
+    <w:basedOn w:val="Normal"/>
+    <w:link w:val="PiedepginaCar"/>
+    <w:uiPriority w:val="99"/>
+    <w:unhideWhenUsed/>
+    <w:rsid w:val="00B73C13"/>
+    <w:pPr>
+      <w:tabs>
+        <w:tab w:val="center" w:pos="4252"/>
+        <w:tab w:val="right" w:pos="8504"/>
+      </w:tabs>
+      <w:spacing w:after="0" w:line="240" w:lineRule="auto"/>
+    </w:pPr>
+  </w:style>
+  <w:style w:type="character" w:customStyle="1" w:styleId="PiedepginaCar">
+    <w:name w:val="Pie de página Car"/>
+    <w:basedOn w:val="Fuentedeprrafopredeter"/>
+    <w:link w:val="Piedepgina"/>
+    <w:uiPriority w:val="99"/>
+    <w:rsid w:val="00B73C13"/>
+  </w:style>
 </w:styles>
 </file>
 

</xml_diff>